<commit_message>
feat: add final project documentation and update course schedule
</commit_message>
<xml_diff>
--- a/comp364-syllabus-8-10-2026.docx
+++ b/comp364-syllabus-8-10-2026.docx
@@ -439,21 +439,7 @@
           <w:sz w:val="22"/>
           <w:szCs w:val="22"/>
         </w:rPr>
-        <w:t>1</w:t>
-      </w:r>
-      <w:r>
-        <w:rPr>
-          <w:sz w:val="22"/>
-          <w:szCs w:val="22"/>
-        </w:rPr>
-        <w:t>:</w:t>
-      </w:r>
-      <w:r>
-        <w:rPr>
-          <w:sz w:val="22"/>
-          <w:szCs w:val="22"/>
-        </w:rPr>
-        <w:t>3</w:t>
+        <w:t>1:3</w:t>
       </w:r>
       <w:r>
         <w:rPr>
@@ -475,28 +461,7 @@
           <w:sz w:val="22"/>
           <w:szCs w:val="22"/>
         </w:rPr>
-        <w:t>2</w:t>
-      </w:r>
-      <w:r>
-        <w:rPr>
-          <w:sz w:val="22"/>
-          <w:szCs w:val="22"/>
-        </w:rPr>
-        <w:t>:</w:t>
-      </w:r>
-      <w:r>
-        <w:rPr>
-          <w:sz w:val="22"/>
-          <w:szCs w:val="22"/>
-        </w:rPr>
-        <w:t>4</w:t>
-      </w:r>
-      <w:r>
-        <w:rPr>
-          <w:sz w:val="22"/>
-          <w:szCs w:val="22"/>
-        </w:rPr>
-        <w:t>5p</w:t>
+        <w:t>2:45p</w:t>
       </w:r>
       <w:r>
         <w:rPr>
@@ -513,10 +478,7 @@
         <w:t xml:space="preserve"> in To</w:t>
       </w:r>
       <w:r>
-        <w:t xml:space="preserve">me </w:t>
-      </w:r>
-      <w:r>
-        <w:t>118</w:t>
+        <w:t>me 118</w:t>
       </w:r>
     </w:p>
     <w:p>
@@ -544,23 +506,7 @@
             <w:sz w:val="22"/>
             <w:szCs w:val="22"/>
           </w:rPr>
-          <w:t>office ho</w:t>
-        </w:r>
-        <w:r>
-          <w:rPr>
-            <w:rStyle w:val="Hyperlink"/>
-            <w:sz w:val="22"/>
-            <w:szCs w:val="22"/>
-          </w:rPr>
-          <w:t>u</w:t>
-        </w:r>
-        <w:r>
-          <w:rPr>
-            <w:rStyle w:val="Hyperlink"/>
-            <w:sz w:val="22"/>
-            <w:szCs w:val="22"/>
-          </w:rPr>
-          <w:t>r webpage</w:t>
+          <w:t>office hour webpage</w:t>
         </w:r>
       </w:hyperlink>
       <w:r>
@@ -1288,16 +1234,7 @@
           <w:sz w:val="22"/>
           <w:szCs w:val="22"/>
         </w:rPr>
-        <w:t>Participation in discussions</w:t>
-      </w:r>
-      <w:r>
-        <w:rPr>
-          <w:b/>
-          <w:bCs/>
-          <w:sz w:val="22"/>
-          <w:szCs w:val="22"/>
-        </w:rPr>
-        <w:t>:</w:t>
+        <w:t>Participation in discussions:</w:t>
       </w:r>
       <w:r>
         <w:rPr>
@@ -1995,23 +1932,7 @@
             <w:sz w:val="22"/>
             <w:szCs w:val="22"/>
           </w:rPr>
-          <w:t>Accommodatin</w:t>
-        </w:r>
-        <w:r>
-          <w:rPr>
-            <w:rStyle w:val="Hyperlink"/>
-            <w:sz w:val="22"/>
-            <w:szCs w:val="22"/>
-          </w:rPr>
-          <w:t>g</w:t>
-        </w:r>
-        <w:r>
-          <w:rPr>
-            <w:rStyle w:val="Hyperlink"/>
-            <w:sz w:val="22"/>
-            <w:szCs w:val="22"/>
-          </w:rPr>
-          <w:t xml:space="preserve"> Students with Disabilities</w:t>
+          <w:t>Accommodating Students with Disabilities</w:t>
         </w:r>
       </w:hyperlink>
       <w:r>
@@ -4898,6 +4819,7 @@
   <w:style w:type="character" w:default="1" w:styleId="DefaultParagraphFont">
     <w:name w:val="Default Paragraph Font"/>
     <w:uiPriority w:val="1"/>
+    <w:semiHidden/>
     <w:unhideWhenUsed/>
   </w:style>
   <w:style w:type="table" w:default="1" w:styleId="TableNormal">

</xml_diff>